<commit_message>
Normalize document template variables
</commit_message>
<xml_diff>
--- a/templates/Machote_seguridad_general_con_calificacion.docx
+++ b/templates/Machote_seguridad_general_con_calificacion.docx
@@ -3758,19 +3758,19 @@
         <w:rPr>
           <w:rFonts w:ascii="Archivo Light" w:hAnsi="Archivo Light" w:cs="Archivo Light"/>
         </w:rPr>
-        <w:t>[INSERTAR DE DOS A TRES P</w:t>
+        <w:t>{{ insertar_dos_a_tres_parrafos }}</w:t>
       </w:r>
       <w:r>
         <w:rPr>
           <w:rFonts w:ascii="Archivo Light" w:hAnsi="Archivo Light" w:cs="Archivo Light"/>
         </w:rPr>
-        <w:t>Á</w:t>
+        <w:t/>
       </w:r>
       <w:r>
         <w:rPr>
           <w:rFonts w:ascii="Archivo Light" w:hAnsi="Archivo Light" w:cs="Archivo Light"/>
         </w:rPr>
-        <w:t>RRAFOS]</w:t>
+        <w:t/>
       </w:r>
     </w:p>
     <w:p>
@@ -3858,7 +3858,7 @@
           <w:color w:val="9C2A1E"/>
           <w:sz w:val="20"/>
         </w:rPr>
-        <w:t>[AÑO INICIAL]</w:t>
+        <w:t>{{ año_inicial }}</w:t>
       </w:r>
       <w:r>
         <w:rPr>
@@ -3877,7 +3877,7 @@
           <w:color w:val="9C2A1E"/>
           <w:sz w:val="20"/>
         </w:rPr>
-        <w:t>[AÑO FINAL]</w:t>
+        <w:t>{{ año_final }}</w:t>
       </w:r>
       <w:r>
         <w:rPr>
@@ -3896,7 +3896,7 @@
           <w:color w:val="9C2A1E"/>
           <w:sz w:val="20"/>
         </w:rPr>
-        <w:t>[MUNICIPIO]</w:t>
+        <w:t>{{ municipio }}</w:t>
       </w:r>
       <w:r>
         <w:rPr>
@@ -3948,7 +3948,7 @@
           <w:color w:val="9C2A1E"/>
           <w:sz w:val="20"/>
         </w:rPr>
-        <w:t>[AÑO INICIAL]</w:t>
+        <w:t>{{ año_inicial }}</w:t>
       </w:r>
       <w:r>
         <w:rPr>
@@ -3967,7 +3967,7 @@
           <w:color w:val="9C2A1E"/>
           <w:sz w:val="20"/>
         </w:rPr>
-        <w:t>[AÑO FINAL]</w:t>
+        <w:t>{{ año_final }}</w:t>
       </w:r>
       <w:r>
         <w:rPr>
@@ -3986,7 +3986,7 @@
           <w:color w:val="9C2A1E"/>
           <w:sz w:val="20"/>
         </w:rPr>
-        <w:t>[MUNICIPIO]</w:t>
+        <w:t>{{ municipio }}</w:t>
       </w:r>
       <w:r>
         <w:rPr>
@@ -4005,7 +4005,7 @@
           <w:color w:val="9C2A1E"/>
           <w:sz w:val="20"/>
         </w:rPr>
-        <w:t>[RUBROS]</w:t>
+        <w:t>{{ rubros }}</w:t>
       </w:r>
       <w:r>
         <w:rPr>
@@ -4057,7 +4057,7 @@
           <w:color w:val="9C2A1E"/>
           <w:sz w:val="20"/>
         </w:rPr>
-        <w:t>[AÑO INICIAL]</w:t>
+        <w:t>{{ año_inicial }}</w:t>
       </w:r>
       <w:r>
         <w:rPr>
@@ -4076,7 +4076,7 @@
           <w:color w:val="9C2A1E"/>
           <w:sz w:val="20"/>
         </w:rPr>
-        <w:t>[AÑO FINAL]</w:t>
+        <w:t>{{ año_final }}</w:t>
       </w:r>
       <w:r>
         <w:rPr>
@@ -4095,7 +4095,7 @@
           <w:color w:val="9C2A1E"/>
           <w:sz w:val="20"/>
         </w:rPr>
-        <w:t>[MUNICIPIO]</w:t>
+        <w:t>{{ municipio }}</w:t>
       </w:r>
       <w:r>
         <w:rPr>
@@ -4114,7 +4114,7 @@
           <w:color w:val="9C2A1E"/>
           <w:sz w:val="20"/>
         </w:rPr>
-        <w:t>[RUBROS]</w:t>
+        <w:t>{{ rubros }}</w:t>
       </w:r>
       <w:r>
         <w:rPr>
@@ -4166,7 +4166,7 @@
           <w:color w:val="9C2A1E"/>
           <w:sz w:val="20"/>
         </w:rPr>
-        <w:t>[AÑO INICIAL]</w:t>
+        <w:t>{{ año_inicial }}</w:t>
       </w:r>
       <w:r>
         <w:rPr>
@@ -4185,7 +4185,7 @@
           <w:color w:val="9C2A1E"/>
           <w:sz w:val="20"/>
         </w:rPr>
-        <w:t>[AÑO FINAL]</w:t>
+        <w:t>{{ año_final }}</w:t>
       </w:r>
       <w:r>
         <w:rPr>
@@ -4204,7 +4204,7 @@
           <w:color w:val="9C2A1E"/>
           <w:sz w:val="20"/>
         </w:rPr>
-        <w:t>[MUNICIPIO]</w:t>
+        <w:t>{{ municipio }}</w:t>
       </w:r>
       <w:r>
         <w:rPr>
@@ -4223,7 +4223,7 @@
           <w:color w:val="9C2A1E"/>
           <w:sz w:val="20"/>
         </w:rPr>
-        <w:t>[RUBROS]</w:t>
+        <w:t>{{ rubros }}</w:t>
       </w:r>
       <w:r>
         <w:rPr>
@@ -4242,7 +4242,7 @@
           <w:color w:val="9C2A1E"/>
           <w:sz w:val="20"/>
         </w:rPr>
-        <w:t>[CONDICIONES FALTANTES]</w:t>
+        <w:t>{{ condiciones_faltantes }}</w:t>
       </w:r>
       <w:r>
         <w:rPr>
@@ -4294,7 +4294,7 @@
           <w:color w:val="9C2A1E"/>
           <w:sz w:val="20"/>
         </w:rPr>
-        <w:t>[AÑO INICIAL]</w:t>
+        <w:t>{{ año_inicial }}</w:t>
       </w:r>
       <w:r>
         <w:rPr>
@@ -4313,7 +4313,7 @@
           <w:color w:val="9C2A1E"/>
           <w:sz w:val="20"/>
         </w:rPr>
-        <w:t>[AÑO FINAL]</w:t>
+        <w:t>{{ año_final }}</w:t>
       </w:r>
       <w:r>
         <w:rPr>
@@ -4332,7 +4332,7 @@
           <w:color w:val="9C2A1E"/>
           <w:sz w:val="20"/>
         </w:rPr>
-        <w:t>[MUNICIPIO]</w:t>
+        <w:t>{{ municipio }}</w:t>
       </w:r>
       <w:r>
         <w:rPr>
@@ -4429,7 +4429,7 @@
           <w:color w:val="9C2A1E"/>
           <w:sz w:val="20"/>
         </w:rPr>
-        <w:t>[ESTADO]</w:t>
+        <w:t>{{ estado }}</w:t>
       </w:r>
       <w:r>
         <w:rPr>
@@ -4448,7 +4448,7 @@
           <w:color w:val="9C2A1E"/>
           <w:sz w:val="20"/>
         </w:rPr>
-        <w:t>[MUNICIPIO]</w:t>
+        <w:t>{{ municipio }}</w:t>
       </w:r>
       <w:r>
         <w:rPr>
@@ -4467,7 +4467,7 @@
           <w:color w:val="9C2A1E"/>
           <w:sz w:val="20"/>
         </w:rPr>
-        <w:t>[N]</w:t>
+        <w:t>{{ n }}</w:t>
       </w:r>
       <w:r>
         <w:rPr>
@@ -4486,7 +4486,7 @@
           <w:color w:val="9C2A1E"/>
           <w:sz w:val="20"/>
         </w:rPr>
-        <w:t>[TOTAL]</w:t>
+        <w:t>{{ total }}</w:t>
       </w:r>
       <w:r>
         <w:rPr>
@@ -4505,7 +4505,7 @@
           <w:color w:val="9C2A1E"/>
           <w:sz w:val="20"/>
         </w:rPr>
-        <w:t>[INDICADORES]</w:t>
+        <w:t>{{ indicadores }}</w:t>
       </w:r>
       <w:r>
         <w:rPr>
@@ -4548,7 +4548,7 @@
           <w:color w:val="9C2A1E"/>
           <w:sz w:val="20"/>
         </w:rPr>
-        <w:t>[MUNICIPIO]</w:t>
+        <w:t>{{ municipio }}</w:t>
       </w:r>
       <w:r>
         <w:rPr>
@@ -4567,7 +4567,7 @@
           <w:color w:val="9C2A1E"/>
           <w:sz w:val="20"/>
         </w:rPr>
-        <w:t>[ESTADO]</w:t>
+        <w:t>{{ estado }}</w:t>
       </w:r>
       <w:r>
         <w:rPr>
@@ -4586,7 +4586,7 @@
           <w:color w:val="9C2A1E"/>
           <w:sz w:val="20"/>
         </w:rPr>
-        <w:t>[INDICADORES]</w:t>
+        <w:t>{{ indicadores }}</w:t>
       </w:r>
       <w:r>
         <w:rPr>
@@ -4629,7 +4629,7 @@
           <w:color w:val="9C2A1E"/>
           <w:sz w:val="20"/>
         </w:rPr>
-        <w:t>[MUNICIPIO]</w:t>
+        <w:t>{{ municipio }}</w:t>
       </w:r>
       <w:r>
         <w:rPr>
@@ -4648,7 +4648,7 @@
           <w:color w:val="9C2A1E"/>
           <w:sz w:val="20"/>
         </w:rPr>
-        <w:t>[N]</w:t>
+        <w:t>{{ n }}</w:t>
       </w:r>
       <w:r>
         <w:rPr>
@@ -4667,7 +4667,7 @@
           <w:color w:val="9C2A1E"/>
           <w:sz w:val="20"/>
         </w:rPr>
-        <w:t>[TOTAL]</w:t>
+        <w:t>{{ total }}</w:t>
       </w:r>
       <w:r>
         <w:rPr>
@@ -4686,7 +4686,7 @@
           <w:color w:val="9C2A1E"/>
           <w:sz w:val="20"/>
         </w:rPr>
-        <w:t>[INDICADORES]</w:t>
+        <w:t>{{ indicadores }}</w:t>
       </w:r>
       <w:r>
         <w:rPr>
@@ -4705,7 +4705,7 @@
           <w:color w:val="9C2A1E"/>
           <w:sz w:val="20"/>
         </w:rPr>
-        <w:t>[ESTADO]</w:t>
+        <w:t>{{ estado }}</w:t>
       </w:r>
       <w:r>
         <w:rPr>
@@ -4724,7 +4724,7 @@
           <w:color w:val="9C2A1E"/>
           <w:sz w:val="20"/>
         </w:rPr>
-        <w:t>[CAPACIDAD]</w:t>
+        <w:t>{{ capacidad }}</w:t>
       </w:r>
       <w:r>
         <w:rPr>
@@ -4776,7 +4776,7 @@
           <w:color w:val="9C2A1E"/>
           <w:sz w:val="20"/>
         </w:rPr>
-        <w:t>[ESTADO]</w:t>
+        <w:t>{{ estado }}</w:t>
       </w:r>
       <w:r>
         <w:rPr>
@@ -4795,7 +4795,7 @@
           <w:color w:val="9C2A1E"/>
           <w:sz w:val="20"/>
         </w:rPr>
-        <w:t>[INDICADOR]</w:t>
+        <w:t>{{ indicador }}</w:t>
       </w:r>
       <w:r>
         <w:rPr>
@@ -4814,7 +4814,7 @@
           <w:color w:val="9C2A1E"/>
           <w:sz w:val="20"/>
         </w:rPr>
-        <w:t>[X]</w:t>
+        <w:t>{{ x }}</w:t>
       </w:r>
       <w:r>
         <w:rPr>
@@ -4911,7 +4911,7 @@
           <w:color w:val="9C2A1E"/>
           <w:sz w:val="20"/>
         </w:rPr>
-        <w:t>[MUNICIPIO]</w:t>
+        <w:t>{{ municipio }}</w:t>
       </w:r>
       <w:r>
         <w:rPr>
@@ -4930,7 +4930,7 @@
           <w:color w:val="9C2A1E"/>
           <w:sz w:val="20"/>
         </w:rPr>
-        <w:t>[INDICADORES]</w:t>
+        <w:t>{{ indicadores }}</w:t>
       </w:r>
       <w:r>
         <w:rPr>
@@ -4949,7 +4949,7 @@
           <w:color w:val="9C2A1E"/>
           <w:sz w:val="20"/>
         </w:rPr>
-        <w:t>[SITUACIÓN INICIAL]</w:t>
+        <w:t>{{ situacion_inicial }}</w:t>
       </w:r>
       <w:r>
         <w:rPr>
@@ -4968,7 +4968,7 @@
           <w:color w:val="9C2A1E"/>
           <w:sz w:val="20"/>
         </w:rPr>
-        <w:t>[SITUACIÓN FINAL]</w:t>
+        <w:t>{{ situacion_final }}</w:t>
       </w:r>
       <w:r>
         <w:rPr>
@@ -5020,7 +5020,7 @@
           <w:color w:val="9C2A1E"/>
           <w:sz w:val="20"/>
         </w:rPr>
-        <w:t>[INDICADOR]</w:t>
+        <w:t>{{ indicador }}</w:t>
       </w:r>
       <w:r>
         <w:rPr>
@@ -5039,7 +5039,7 @@
           <w:color w:val="9C2A1E"/>
           <w:sz w:val="20"/>
         </w:rPr>
-        <w:t>[AÑOS]</w:t>
+        <w:t>{{ años }}</w:t>
       </w:r>
       <w:r>
         <w:rPr>
@@ -5058,7 +5058,7 @@
           <w:color w:val="9C2A1E"/>
           <w:sz w:val="20"/>
         </w:rPr>
-        <w:t>[AÑOS]</w:t>
+        <w:t>{{ años }}</w:t>
       </w:r>
       <w:r>
         <w:rPr>
@@ -5077,7 +5077,7 @@
           <w:color w:val="9C2A1E"/>
           <w:sz w:val="20"/>
         </w:rPr>
-        <w:t>[CAMBIO DE ADMINISTRACIÓN / FIN DE UN SUBSIDIO / OTRO]</w:t>
+        <w:t>{{ cambio_administracion_fin_subsidio_otro }}</w:t>
       </w:r>
       <w:r>
         <w:rPr>
@@ -5129,7 +5129,7 @@
           <w:color w:val="9C2A1E"/>
           <w:sz w:val="20"/>
         </w:rPr>
-        <w:t>[INDICADORES]</w:t>
+        <w:t>{{ indicadores }}</w:t>
       </w:r>
       <w:r>
         <w:rPr>
@@ -5148,7 +5148,7 @@
           <w:color w:val="9C2A1E"/>
           <w:sz w:val="20"/>
         </w:rPr>
-        <w:t>[NIVEL]</w:t>
+        <w:t>{{ nivel }}</w:t>
       </w:r>
       <w:r>
         <w:rPr>
@@ -5200,7 +5200,7 @@
           <w:color w:val="9C2A1E"/>
           <w:sz w:val="20"/>
         </w:rPr>
-        <w:t>[INDICADORES]</w:t>
+        <w:t>{{ indicadores }}</w:t>
       </w:r>
       <w:r>
         <w:rPr>
@@ -5219,7 +5219,7 @@
           <w:color w:val="9C2A1E"/>
           <w:sz w:val="20"/>
         </w:rPr>
-        <w:t>[X]</w:t>
+        <w:t>{{ x }}</w:t>
       </w:r>
       <w:r>
         <w:rPr>
@@ -5238,7 +5238,7 @@
           <w:color w:val="9C2A1E"/>
           <w:sz w:val="20"/>
         </w:rPr>
-        <w:t>[Y]</w:t>
+        <w:t>{{ y }}</w:t>
       </w:r>
       <w:r>
         <w:rPr>
@@ -5257,7 +5257,7 @@
           <w:color w:val="9C2A1E"/>
           <w:sz w:val="20"/>
         </w:rPr>
-        <w:t>[AÑO]</w:t>
+        <w:t>{{ año }}</w:t>
       </w:r>
       <w:r>
         <w:rPr>
@@ -5276,7 +5276,7 @@
           <w:color w:val="9C2A1E"/>
           <w:sz w:val="20"/>
         </w:rPr>
-        <w:t>[AÑO]</w:t>
+        <w:t>{{ año }}</w:t>
       </w:r>
       <w:r>
         <w:rPr>
@@ -5328,7 +5328,7 @@
           <w:color w:val="9C2A1E"/>
           <w:sz w:val="20"/>
         </w:rPr>
-        <w:t>[AÑOS / INDICADORES]</w:t>
+        <w:t>{{ años_indicadores }}</w:t>
       </w:r>
       <w:r>
         <w:rPr>
@@ -5385,19 +5385,19 @@
         <w:rPr>
           <w:rFonts w:ascii="Archivo Light" w:hAnsi="Archivo Light" w:cs="Archivo Light"/>
         </w:rPr>
-        <w:t>[INSERTAR DE DOS A TRES P</w:t>
+        <w:t>{{ insertar_dos_a_tres_parrafos }}</w:t>
       </w:r>
       <w:r>
         <w:rPr>
           <w:rFonts w:ascii="Archivo Light" w:hAnsi="Archivo Light" w:cs="Archivo Light"/>
         </w:rPr>
-        <w:t>Á</w:t>
+        <w:t/>
       </w:r>
       <w:r>
         <w:rPr>
           <w:rFonts w:ascii="Archivo Light" w:hAnsi="Archivo Light" w:cs="Archivo Light"/>
         </w:rPr>
-        <w:t>RRAFOS]</w:t>
+        <w:t/>
       </w:r>
     </w:p>
     <w:p>
@@ -5536,7 +5536,7 @@
           <w:color w:val="9C2A1E"/>
           <w:sz w:val="20"/>
         </w:rPr>
-        <w:t>[AÑO]</w:t>
+        <w:t>{{ año }}</w:t>
       </w:r>
       <w:r>
         <w:rPr>
@@ -5555,7 +5555,7 @@
           <w:color w:val="9C2A1E"/>
           <w:sz w:val="20"/>
         </w:rPr>
-        <w:t>[AÑO]</w:t>
+        <w:t>{{ año }}</w:t>
       </w:r>
       <w:r>
         <w:rPr>
@@ -5574,7 +5574,7 @@
           <w:color w:val="9C2A1E"/>
           <w:sz w:val="20"/>
         </w:rPr>
-        <w:t>[MUNICIPIO]</w:t>
+        <w:t>{{ municipio }}</w:t>
       </w:r>
       <w:r>
         <w:rPr>
@@ -5593,7 +5593,7 @@
           <w:color w:val="9C2A1E"/>
           <w:sz w:val="20"/>
         </w:rPr>
-        <w:t>[igual / superior]</w:t>
+        <w:t>{{ comparacion_con_periodo_completo }}</w:t>
       </w:r>
       <w:r>
         <w:rPr>
@@ -5645,7 +5645,7 @@
           <w:color w:val="9C2A1E"/>
           <w:sz w:val="20"/>
         </w:rPr>
-        <w:t>[AÑO]</w:t>
+        <w:t>{{ año }}</w:t>
       </w:r>
       <w:r>
         <w:rPr>
@@ -5664,7 +5664,7 @@
           <w:color w:val="9C2A1E"/>
           <w:sz w:val="20"/>
         </w:rPr>
-        <w:t>[AÑO]</w:t>
+        <w:t>{{ año }}</w:t>
       </w:r>
       <w:r>
         <w:rPr>
@@ -5683,7 +5683,7 @@
           <w:color w:val="9C2A1E"/>
           <w:sz w:val="20"/>
         </w:rPr>
-        <w:t>[MUNICIPIO]</w:t>
+        <w:t>{{ municipio }}</w:t>
       </w:r>
       <w:r>
         <w:rPr>
@@ -5702,7 +5702,7 @@
           <w:color w:val="9C2A1E"/>
           <w:sz w:val="20"/>
         </w:rPr>
-        <w:t>[igual / superior / inferior]</w:t>
+        <w:t>{{ comparacion_con_periodo_completo }}</w:t>
       </w:r>
       <w:r>
         <w:rPr>
@@ -5721,7 +5721,7 @@
           <w:color w:val="9C2A1E"/>
           <w:sz w:val="20"/>
         </w:rPr>
-        <w:t>[DIMENSIÓN]</w:t>
+        <w:t>{{ dimension }}</w:t>
       </w:r>
       <w:r>
         <w:rPr>
@@ -5773,7 +5773,7 @@
           <w:color w:val="9C2A1E"/>
           <w:sz w:val="20"/>
         </w:rPr>
-        <w:t>[AÑO]</w:t>
+        <w:t>{{ año }}</w:t>
       </w:r>
       <w:r>
         <w:rPr>
@@ -5792,7 +5792,7 @@
           <w:color w:val="9C2A1E"/>
           <w:sz w:val="20"/>
         </w:rPr>
-        <w:t>[AÑO]</w:t>
+        <w:t>{{ año }}</w:t>
       </w:r>
       <w:r>
         <w:rPr>
@@ -5811,7 +5811,7 @@
           <w:color w:val="9C2A1E"/>
           <w:sz w:val="20"/>
         </w:rPr>
-        <w:t>[MUNICIPIO]</w:t>
+        <w:t>{{ municipio }}</w:t>
       </w:r>
       <w:r>
         <w:rPr>
@@ -5830,7 +5830,7 @@
           <w:color w:val="9C2A1E"/>
           <w:sz w:val="20"/>
         </w:rPr>
-        <w:t>[igual / superior / inferior]</w:t>
+        <w:t>{{ comparacion_con_periodo_completo }}</w:t>
       </w:r>
       <w:r>
         <w:rPr>
@@ -5849,7 +5849,7 @@
           <w:color w:val="9C2A1E"/>
           <w:sz w:val="20"/>
         </w:rPr>
-        <w:t>[DIMENSIONES]</w:t>
+        <w:t>{{ dimensiones }}</w:t>
       </w:r>
       <w:r>
         <w:rPr>
@@ -5901,7 +5901,7 @@
           <w:color w:val="9C2A1E"/>
           <w:sz w:val="20"/>
         </w:rPr>
-        <w:t>[AÑO]</w:t>
+        <w:t>{{ año }}</w:t>
       </w:r>
       <w:r>
         <w:rPr>
@@ -5920,7 +5920,7 @@
           <w:color w:val="9C2A1E"/>
           <w:sz w:val="20"/>
         </w:rPr>
-        <w:t>[AÑO]</w:t>
+        <w:t>{{ año }}</w:t>
       </w:r>
       <w:r>
         <w:rPr>
@@ -5939,7 +5939,7 @@
           <w:color w:val="9C2A1E"/>
           <w:sz w:val="20"/>
         </w:rPr>
-        <w:t>[MUNICIPIO]</w:t>
+        <w:t>{{ municipio }}</w:t>
       </w:r>
       <w:r>
         <w:rPr>
@@ -5958,7 +5958,7 @@
           <w:color w:val="9C2A1E"/>
           <w:sz w:val="20"/>
         </w:rPr>
-        <w:t>[igual / superior / inferior]</w:t>
+        <w:t>{{ comparacion_con_periodo_completo }}</w:t>
       </w:r>
       <w:r>
         <w:rPr>
@@ -5977,7 +5977,7 @@
           <w:color w:val="9C2A1E"/>
           <w:sz w:val="20"/>
         </w:rPr>
-        <w:t>[DIMENSIONES]</w:t>
+        <w:t>{{ dimensiones }}</w:t>
       </w:r>
       <w:r>
         <w:rPr>
@@ -6029,7 +6029,7 @@
           <w:color w:val="9C2A1E"/>
           <w:sz w:val="20"/>
         </w:rPr>
-        <w:t>[AÑO]</w:t>
+        <w:t>{{ año }}</w:t>
       </w:r>
       <w:r>
         <w:rPr>
@@ -6048,7 +6048,7 @@
           <w:color w:val="9C2A1E"/>
           <w:sz w:val="20"/>
         </w:rPr>
-        <w:t>[AÑO]</w:t>
+        <w:t>{{ año }}</w:t>
       </w:r>
       <w:r>
         <w:rPr>
@@ -6067,7 +6067,7 @@
           <w:color w:val="9C2A1E"/>
           <w:sz w:val="20"/>
         </w:rPr>
-        <w:t>[MUNICIPIO]</w:t>
+        <w:t>{{ municipio }}</w:t>
       </w:r>
       <w:r>
         <w:rPr>
@@ -6086,7 +6086,7 @@
           <w:color w:val="9C2A1E"/>
           <w:sz w:val="20"/>
         </w:rPr>
-        <w:t>[igual / inferior]</w:t>
+        <w:t>{{ comparacion_con_periodo_completo }}</w:t>
       </w:r>
       <w:r>
         <w:rPr>
@@ -6216,7 +6216,7 @@
           <w:color w:val="9C2A1E"/>
           <w:sz w:val="20"/>
         </w:rPr>
-        <w:t>[TEMAS]</w:t>
+        <w:t>{{ temas }}</w:t>
       </w:r>
       <w:r>
         <w:rPr>
@@ -6235,7 +6235,7 @@
           <w:color w:val="9C2A1E"/>
           <w:sz w:val="20"/>
         </w:rPr>
-        <w:t>[TEMAS FALTANTES]</w:t>
+        <w:t>{{ temas_faltantes }}</w:t>
       </w:r>
       <w:r>
         <w:rPr>
@@ -6287,7 +6287,7 @@
           <w:color w:val="9C2A1E"/>
           <w:sz w:val="20"/>
         </w:rPr>
-        <w:t>[existe programa, pero no hubo capacitación / hubo capacitación, pero no hay programa vigente]</w:t>
+        <w:t>{{ situacion_programa_capacitacion }}</w:t>
       </w:r>
       <w:r>
         <w:rPr>
@@ -6483,7 +6483,7 @@
           <w:color w:val="9C2A1E"/>
           <w:sz w:val="20"/>
         </w:rPr>
-        <w:t>[RUBROS]</w:t>
+        <w:t>{{ rubros }}</w:t>
       </w:r>
       <w:r>
         <w:rPr>
@@ -6502,7 +6502,7 @@
           <w:color w:val="9C2A1E"/>
           <w:sz w:val="20"/>
         </w:rPr>
-        <w:t>[RUBRO]</w:t>
+        <w:t>{{ rubro }}</w:t>
       </w:r>
       <w:r>
         <w:rPr>
@@ -6554,7 +6554,7 @@
           <w:color w:val="9C2A1E"/>
           <w:sz w:val="20"/>
         </w:rPr>
-        <w:t>[la dotación es incompleta / la capacitación no tiene continuidad / el estado de fuerza apenas alcanza para cubrir turnos]</w:t>
+        <w:t>{{ situacion_desempeno_personal }}</w:t>
       </w:r>
       <w:r>
         <w:rPr>
@@ -6606,7 +6606,7 @@
           <w:color w:val="9C2A1E"/>
           <w:sz w:val="20"/>
         </w:rPr>
-        <w:t>[parte del personal no tiene control de confianza o CUP vigente / el estado de fuerza está por debajo del mínimo / no hay equipo de protección suficiente]</w:t>
+        <w:t>{{ carencia_relevante }}</w:t>
       </w:r>
       <w:r>
         <w:rPr>
@@ -6658,7 +6658,7 @@
           <w:color w:val="9C2A1E"/>
           <w:sz w:val="20"/>
         </w:rPr>
-        <w:t>[personal sin certificación / sin equipo de protección / sin capacitación / sin datos]</w:t>
+        <w:t>{{ condicion_critica }}</w:t>
       </w:r>
       <w:r>
         <w:rPr>
@@ -6788,7 +6788,7 @@
           <w:color w:val="9C2A1E"/>
           <w:sz w:val="20"/>
         </w:rPr>
-        <w:t>[HERRAMIENTA]</w:t>
+        <w:t>{{ herramienta }}</w:t>
       </w:r>
       <w:r>
         <w:rPr>
@@ -6807,7 +6807,7 @@
           <w:color w:val="9C2A1E"/>
           <w:sz w:val="20"/>
         </w:rPr>
-        <w:t>[INDICADORES DE EFICIENCIA]</w:t>
+        <w:t>{{ indicadores_de_eficiencia }}</w:t>
       </w:r>
       <w:r>
         <w:rPr>
@@ -6859,7 +6859,7 @@
           <w:color w:val="9C2A1E"/>
           <w:sz w:val="20"/>
         </w:rPr>
-        <w:t>[cámaras / registro de llamadas]</w:t>
+        <w:t>{{ herramienta_aislada }}</w:t>
       </w:r>
       <w:r>
         <w:rPr>
@@ -6911,7 +6911,7 @@
           <w:color w:val="9C2A1E"/>
           <w:sz w:val="20"/>
         </w:rPr>
-        <w:t>[las puestas a disposición no guardan relación con la incidencia / se registraron fallecimientos de policías / no hay informe de resultados]</w:t>
+        <w:t>{{ problema_critico }}</w:t>
       </w:r>
       <w:r>
         <w:rPr>
@@ -7227,7 +7227,7 @@
           <w:color w:val="9C2A1E"/>
           <w:sz w:val="20"/>
         </w:rPr>
-        <w:t>[DIMENSIONES]</w:t>
+        <w:t>{{ dimensiones }}</w:t>
       </w:r>
       <w:r>
         <w:rPr>
@@ -7312,7 +7312,7 @@
           <w:color w:val="9C2A1E"/>
           <w:sz w:val="20"/>
         </w:rPr>
-        <w:t>[DIMENSIONES]</w:t>
+        <w:t>{{ dimensiones }}</w:t>
       </w:r>
       <w:r>
         <w:rPr>
@@ -7944,7 +7944,7 @@
           <w:color w:val="9C2A1E"/>
           <w:sz w:val="20"/>
         </w:rPr>
-        <w:t>[INDICADORES CON 4 O 5]</w:t>
+        <w:t>{{ indicadores_con_4_o_5 }}</w:t>
       </w:r>
       <w:r>
         <w:rPr>
@@ -7963,7 +7963,7 @@
           <w:color w:val="9C2A1E"/>
           <w:sz w:val="20"/>
         </w:rPr>
-        <w:t>[MUNICIPIO]</w:t>
+        <w:t>{{ municipio }}</w:t>
       </w:r>
       <w:r>
         <w:rPr>
@@ -7982,7 +7982,7 @@
           <w:color w:val="9C2A1E"/>
           <w:sz w:val="20"/>
         </w:rPr>
-        <w:t>[CAPACIDAD]</w:t>
+        <w:t>{{ capacidad }}</w:t>
       </w:r>
       <w:r>
         <w:rPr>
@@ -8001,7 +8001,7 @@
           <w:color w:val="9C2A1E"/>
           <w:sz w:val="20"/>
         </w:rPr>
-        <w:t>[por encima de / al nivel de]</w:t>
+        <w:t>{{ posicion_relativa }}</w:t>
       </w:r>
       <w:r>
         <w:rPr>
@@ -8020,7 +8020,7 @@
           <w:color w:val="9C2A1E"/>
           <w:sz w:val="20"/>
         </w:rPr>
-        <w:t>[ESTADO]</w:t>
+        <w:t>{{ estado }}</w:t>
       </w:r>
       <w:r>
         <w:rPr>
@@ -8072,7 +8072,7 @@
           <w:color w:val="9C2A1E"/>
           <w:sz w:val="20"/>
         </w:rPr>
-        <w:t>[INDICADORES CON 1 O 2]</w:t>
+        <w:t>{{ indicadores_con_1_o_2 }}</w:t>
       </w:r>
       <w:r>
         <w:rPr>
@@ -8091,7 +8091,7 @@
           <w:color w:val="9C2A1E"/>
           <w:sz w:val="20"/>
         </w:rPr>
-        <w:t>[DIMENSIÓN]</w:t>
+        <w:t>{{ dimension }}</w:t>
       </w:r>
       <w:r>
         <w:rPr>
@@ -8110,7 +8110,7 @@
           <w:color w:val="9C2A1E"/>
           <w:sz w:val="20"/>
         </w:rPr>
-        <w:t>[ESTÁNDAR]</w:t>
+        <w:t>{{ estandar }}</w:t>
       </w:r>
       <w:r>
         <w:rPr>
@@ -8129,7 +8129,7 @@
           <w:color w:val="9C2A1E"/>
           <w:sz w:val="20"/>
         </w:rPr>
-        <w:t>[la protección ante desastres / las condiciones de los policías / la capacidad de prevenir el delito]</w:t>
+        <w:t>{{ dimension_con_carencias }}</w:t>
       </w:r>
       <w:r>
         <w:rPr>
@@ -8248,7 +8248,7 @@
           <w:color w:val="9C2A1E"/>
           <w:sz w:val="20"/>
         </w:rPr>
-        <w:t>[RUBRO]</w:t>
+        <w:t>{{ rubro }}</w:t>
       </w:r>
       <w:r>
         <w:rPr>
@@ -8267,7 +8267,7 @@
           <w:color w:val="9C2A1E"/>
           <w:sz w:val="20"/>
         </w:rPr>
-        <w:t>[RUBRO]</w:t>
+        <w:t>{{ rubro }}</w:t>
       </w:r>
       <w:r>
         <w:rPr>
@@ -9795,7 +9795,7 @@
         <w:rPr>
           <w:rFonts w:ascii="Archivo Light" w:hAnsi="Archivo Light" w:cs="Archivo Light"/>
         </w:rPr>
-        <w:t>[INSERTAR ANÁLISIS E INTERCALAR GRÁFICAS Y/O TABLAS]</w:t>
+        <w:t>{{ insertar_analisis_e_intercalar_graficas_y_o_tablas }}</w:t>
       </w:r>
     </w:p>
     <w:p>
@@ -9987,7 +9987,7 @@
         <w:rPr>
           <w:rFonts w:ascii="Archivo Light" w:hAnsi="Archivo Light" w:cs="Archivo Light"/>
         </w:rPr>
-        <w:t>[INSERTAR ANÁLISIS E INTERCALAR GRÁFICAS Y/O TABLAS]</w:t>
+        <w:t>{{ insertar_analisis_e_intercalar_graficas_y_o_tablas }}</w:t>
       </w:r>
     </w:p>
     <w:p>
@@ -10143,7 +10143,7 @@
         <w:rPr>
           <w:rFonts w:ascii="Archivo Light" w:hAnsi="Archivo Light" w:cs="Archivo Light"/>
         </w:rPr>
-        <w:t>[INSERTAR ANÁLISIS E INTERCALAR GRÁFICAS Y/O TABLAS]</w:t>
+        <w:t>{{ insertar_analisis_e_intercalar_graficas_y_o_tablas }}</w:t>
       </w:r>
     </w:p>
     <w:p>
@@ -11761,7 +11761,7 @@
         <w:rPr>
           <w:rFonts w:ascii="Archivo Light" w:hAnsi="Archivo Light" w:cs="Archivo Light"/>
         </w:rPr>
-        <w:t>[INSERTAR ANÁLISIS E INTERCALAR GRÁFICAS Y/O TABLAS]</w:t>
+        <w:t>{{ insertar_analisis_e_intercalar_graficas_y_o_tablas }}</w:t>
       </w:r>
     </w:p>
     <w:p>
@@ -11902,7 +11902,7 @@
         <w:rPr>
           <w:rFonts w:ascii="Archivo Light" w:hAnsi="Archivo Light" w:cs="Archivo Light"/>
         </w:rPr>
-        <w:t>[INSERTAR ANÁLISIS E INTERCALAR GRÁFICAS Y/O TABLAS]</w:t>
+        <w:t>{{ insertar_analisis_e_intercalar_graficas_y_o_tablas }}</w:t>
       </w:r>
     </w:p>
     <w:p>
@@ -12050,7 +12050,7 @@
         <w:rPr>
           <w:rFonts w:ascii="Archivo Light" w:hAnsi="Archivo Light" w:cs="Archivo Light"/>
         </w:rPr>
-        <w:t>[INSERTAR ANÁLISIS E INTERCALAR GRÁFICAS Y/O TABLAS]</w:t>
+        <w:t>{{ insertar_analisis_e_intercalar_graficas_y_o_tablas }}</w:t>
       </w:r>
     </w:p>
     <w:p>
@@ -12185,7 +12185,7 @@
         <w:rPr>
           <w:rFonts w:ascii="Archivo Light" w:hAnsi="Archivo Light" w:cs="Archivo Light"/>
         </w:rPr>
-        <w:t>[INSERTAR ANÁLISIS E INTERCALAR GRÁFICAS Y/O TABLAS]</w:t>
+        <w:t>{{ insertar_analisis_e_intercalar_graficas_y_o_tablas }}</w:t>
       </w:r>
     </w:p>
     <w:p>
@@ -12322,7 +12322,7 @@
         <w:rPr>
           <w:rFonts w:ascii="Archivo Light" w:hAnsi="Archivo Light" w:cs="Archivo Light"/>
         </w:rPr>
-        <w:t>[INSERTAR ANÁLISIS E INTERCALAR GRÁFICAS Y/O TABLAS]</w:t>
+        <w:t>{{ insertar_analisis_e_intercalar_graficas_y_o_tablas }}</w:t>
       </w:r>
     </w:p>
     <w:p>
@@ -12460,7 +12460,7 @@
         <w:rPr>
           <w:rFonts w:ascii="Archivo Light" w:hAnsi="Archivo Light" w:cs="Archivo Light"/>
         </w:rPr>
-        <w:t>[INSERTAR ANÁLISIS E INTERCALAR GRÁFICAS Y/O TABLAS]</w:t>
+        <w:t>{{ insertar_analisis_e_intercalar_graficas_y_o_tablas }}</w:t>
       </w:r>
     </w:p>
     <w:p>
@@ -12587,7 +12587,7 @@
         <w:rPr>
           <w:rFonts w:ascii="Archivo Light" w:hAnsi="Archivo Light" w:cs="Archivo Light"/>
         </w:rPr>
-        <w:t>[INSERTAR ANÁLISIS E INTERCALAR GRÁFICAS Y/O TABLAS]</w:t>
+        <w:t>{{ insertar_analisis_e_intercalar_graficas_y_o_tablas }}</w:t>
       </w:r>
     </w:p>
     <w:p>
@@ -14190,7 +14190,7 @@
         <w:rPr>
           <w:rFonts w:ascii="Archivo Light" w:hAnsi="Archivo Light" w:cs="Archivo Light"/>
         </w:rPr>
-        <w:t>[INSERTAR ANÁLISIS E INTERCALAR GRÁFICAS Y/O TABLAS]</w:t>
+        <w:t>{{ insertar_analisis_e_intercalar_graficas_y_o_tablas }}</w:t>
       </w:r>
     </w:p>
     <w:p>
@@ -14328,7 +14328,7 @@
         <w:rPr>
           <w:rFonts w:ascii="Archivo Light" w:hAnsi="Archivo Light" w:cs="Archivo Light"/>
         </w:rPr>
-        <w:t>[INSERTAR ANÁLISIS E INTERCALAR GRÁFICAS Y/O TABLAS]</w:t>
+        <w:t>{{ insertar_analisis_e_intercalar_graficas_y_o_tablas }}</w:t>
       </w:r>
     </w:p>
     <w:p>
@@ -14467,7 +14467,7 @@
           <w:rFonts w:ascii="Archivo Light" w:hAnsi="Archivo Light" w:cs="Archivo Light"/>
         </w:rPr>
         <w:lastRenderedPageBreak/>
-        <w:t>[INSERTAR ANÁLISIS E INTERCALAR GRÁFICAS Y/O TABLAS]</w:t>
+        <w:t>{{ insertar_analisis_e_intercalar_graficas_y_o_tablas }}</w:t>
       </w:r>
     </w:p>
     <w:p>
@@ -14594,7 +14594,7 @@
         <w:rPr>
           <w:rFonts w:ascii="Archivo Light" w:hAnsi="Archivo Light" w:cs="Archivo Light"/>
         </w:rPr>
-        <w:t>[INSERTAR ANÁLISIS E INTERCALAR GRÁFICAS Y/O TABLAS]</w:t>
+        <w:t>{{ insertar_analisis_e_intercalar_graficas_y_o_tablas }}</w:t>
       </w:r>
     </w:p>
     <w:p>
@@ -14732,7 +14732,7 @@
         <w:rPr>
           <w:rFonts w:ascii="Archivo Light" w:hAnsi="Archivo Light" w:cs="Archivo Light"/>
         </w:rPr>
-        <w:t>[INSERTAR ANÁLISIS E INTERCALAR GRÁFICAS Y/O TABLAS]</w:t>
+        <w:t>{{ insertar_analisis_e_intercalar_graficas_y_o_tablas }}</w:t>
       </w:r>
     </w:p>
     <w:p>
@@ -14859,7 +14859,7 @@
         <w:rPr>
           <w:rFonts w:ascii="Archivo Light" w:hAnsi="Archivo Light" w:cs="Archivo Light"/>
         </w:rPr>
-        <w:t>[INSERTAR ANÁLISIS E INTERCALAR GRÁFICAS Y/O TABLAS]</w:t>
+        <w:t>{{ insertar_analisis_e_intercalar_graficas_y_o_tablas }}</w:t>
       </w:r>
     </w:p>
     <w:p>
@@ -15454,7 +15454,7 @@
         <w:rPr>
           <w:rFonts w:ascii="Archivo Light" w:hAnsi="Archivo Light" w:cs="Archivo Light"/>
         </w:rPr>
-        <w:t>[INSERTAR ANÁLISIS E INTERCALAR GRÁFICAS Y/O TABLAS]</w:t>
+        <w:t>{{ insertar_analisis_e_intercalar_graficas_y_o_tablas }}</w:t>
       </w:r>
     </w:p>
     <w:p>
@@ -15591,7 +15591,7 @@
         <w:rPr>
           <w:rFonts w:ascii="Archivo Light" w:hAnsi="Archivo Light" w:cs="Archivo Light"/>
         </w:rPr>
-        <w:t>[INSERTAR ANÁLISIS E INTERCALAR GRÁFICAS Y/O TABLAS]</w:t>
+        <w:t>{{ insertar_analisis_e_intercalar_graficas_y_o_tablas }}</w:t>
       </w:r>
     </w:p>
     <w:p>

</xml_diff>

<commit_message>
Polish base document wording
</commit_message>
<xml_diff>
--- a/templates/Machote_seguridad_general_con_calificacion.docx
+++ b/templates/Machote_seguridad_general_con_calificacion.docx
@@ -797,7 +797,7 @@
           <w:i w:val="0"/>
           <w:sz w:val="20"/>
         </w:rPr>
-        <w:t>Las tres dimensiones del machote son: (A) Protección civil, indicadores 1 a 3; (B) Condiciones del personal, indicadores 4 a 10; (C) Inteligencia y eficiencia policial, indicadores 11 a 18. El puntaje de cada dimensión es el promedio simple de sus indicadores.</w:t>
+        <w:t>El diagnóstico se organiza en tres dimensiones: (A) Protección civil, indicadores 1 a 3; (B) Condiciones del personal, indicadores 4 a 10; (C) Inteligencia y eficiencia policial, indicadores 11 a 18. El puntaje de cada dimensión es el promedio simple de sus indicadores.</w:t>
       </w:r>
     </w:p>
     <w:p>
@@ -17213,7 +17213,7 @@
           <w:i w:val="0"/>
           <w:sz w:val="20"/>
         </w:rPr>
-        <w:t>Por eso el benchmark funciona como un piso de capacidad, no como una medida de desempeño: un municipio puede superarlo y aun así no tener cobertura efectiva si la plantilla no alcanza para sostener turnos.</w:t>
+        <w:t>Por eso el benchmark funciona como un piso de capacidad, no como una medida de desempeño: un municipio puede superarlo y aun así no tener cobertura efectiva si el personal disponible no alcanza para sostener turnos.</w:t>
       </w:r>
     </w:p>
     <w:p>
@@ -17548,7 +17548,7 @@
           <w:color w:val="404040"/>
           <w:sz w:val="19"/>
         </w:rPr>
-        <w:t>Criterio ajustable: si la plantilla total tiene menos de 15 elementos, el puntaje máximo es 4, porque la cobertura por turno es insuficiente aunque la tasa sea alta.</w:t>
+        <w:t>Criterio ajustable: si el estado de fuerza total tiene menos de 15 elementos, el puntaje máximo es 4, porque la cobertura por turno es insuficiente aunque la tasa sea alta.</w:t>
       </w:r>
     </w:p>
     <w:p>
@@ -23802,7 +23802,7 @@
           <w:color w:val="1F3A5F"/>
           <w:sz w:val="26"/>
         </w:rPr>
-        <w:t>Anexo 2. Indicadores frente a temas del machote y literatura</w:t>
+        <w:t>Anexo 2. Indicadores por dimensión del diagnóstico y literatura</w:t>
       </w:r>
     </w:p>
     <w:p>
@@ -23876,7 +23876,7 @@
                 <w:color w:val="FFFFFF"/>
                 <w:sz w:val="16"/>
               </w:rPr>
-              <w:t>Tema del machote</w:t>
+              <w:t>Dimensión del diagnóstico</w:t>
             </w:r>
           </w:p>
         </w:tc>

</xml_diff>

<commit_message>
Add municipal pipeline prevalidation
</commit_message>
<xml_diff>
--- a/templates/Machote_seguridad_general_con_calificacion.docx
+++ b/templates/Machote_seguridad_general_con_calificacion.docx
@@ -3758,7 +3758,7 @@
         <w:rPr>
           <w:rFonts w:ascii="Archivo Light" w:hAnsi="Archivo Light" w:cs="Archivo Light"/>
         </w:rPr>
-        <w:t>{{ insertar_dos_a_tres_parrafos }}</w:t>
+        <w:t>{{ resumen_general }}</w:t>
       </w:r>
       <w:r>
         <w:rPr>
@@ -5257,7 +5257,7 @@
           <w:color w:val="9C2A1E"/>
           <w:sz w:val="20"/>
         </w:rPr>
-        <w:t>{{ año }}</w:t>
+        <w:t>{{ año_deterioro_inicial }}</w:t>
       </w:r>
       <w:r>
         <w:rPr>
@@ -5276,7 +5276,7 @@
           <w:color w:val="9C2A1E"/>
           <w:sz w:val="20"/>
         </w:rPr>
-        <w:t>{{ año }}</w:t>
+        <w:t>{{ año_deterioro_final }}</w:t>
       </w:r>
       <w:r>
         <w:rPr>
@@ -5385,7 +5385,7 @@
         <w:rPr>
           <w:rFonts w:ascii="Archivo Light" w:hAnsi="Archivo Light" w:cs="Archivo Light"/>
         </w:rPr>
-        <w:t>{{ insertar_dos_a_tres_parrafos }}</w:t>
+        <w:t>{{ resumen_ultimo_periodo }}</w:t>
       </w:r>
       <w:r>
         <w:rPr>
@@ -5536,7 +5536,7 @@
           <w:color w:val="9C2A1E"/>
           <w:sz w:val="20"/>
         </w:rPr>
-        <w:t>{{ año }}</w:t>
+        <w:t>{{ año_ultimo_periodo_inicial }}</w:t>
       </w:r>
       <w:r>
         <w:rPr>
@@ -5555,7 +5555,7 @@
           <w:color w:val="9C2A1E"/>
           <w:sz w:val="20"/>
         </w:rPr>
-        <w:t>{{ año }}</w:t>
+        <w:t>{{ año_ultimo_periodo_final }}</w:t>
       </w:r>
       <w:r>
         <w:rPr>
@@ -5645,7 +5645,7 @@
           <w:color w:val="9C2A1E"/>
           <w:sz w:val="20"/>
         </w:rPr>
-        <w:t>{{ año }}</w:t>
+        <w:t>{{ año_ultimo_periodo_inicial }}</w:t>
       </w:r>
       <w:r>
         <w:rPr>
@@ -5664,7 +5664,7 @@
           <w:color w:val="9C2A1E"/>
           <w:sz w:val="20"/>
         </w:rPr>
-        <w:t>{{ año }}</w:t>
+        <w:t>{{ año_ultimo_periodo_final }}</w:t>
       </w:r>
       <w:r>
         <w:rPr>
@@ -5773,7 +5773,7 @@
           <w:color w:val="9C2A1E"/>
           <w:sz w:val="20"/>
         </w:rPr>
-        <w:t>{{ año }}</w:t>
+        <w:t>{{ año_ultimo_periodo_inicial }}</w:t>
       </w:r>
       <w:r>
         <w:rPr>
@@ -5792,7 +5792,7 @@
           <w:color w:val="9C2A1E"/>
           <w:sz w:val="20"/>
         </w:rPr>
-        <w:t>{{ año }}</w:t>
+        <w:t>{{ año_ultimo_periodo_final }}</w:t>
       </w:r>
       <w:r>
         <w:rPr>
@@ -5901,7 +5901,7 @@
           <w:color w:val="9C2A1E"/>
           <w:sz w:val="20"/>
         </w:rPr>
-        <w:t>{{ año }}</w:t>
+        <w:t>{{ año_ultimo_periodo_inicial }}</w:t>
       </w:r>
       <w:r>
         <w:rPr>
@@ -5920,7 +5920,7 @@
           <w:color w:val="9C2A1E"/>
           <w:sz w:val="20"/>
         </w:rPr>
-        <w:t>{{ año }}</w:t>
+        <w:t>{{ año_ultimo_periodo_final }}</w:t>
       </w:r>
       <w:r>
         <w:rPr>
@@ -6029,7 +6029,7 @@
           <w:color w:val="9C2A1E"/>
           <w:sz w:val="20"/>
         </w:rPr>
-        <w:t>{{ año }}</w:t>
+        <w:t>{{ año_ultimo_periodo_inicial }}</w:t>
       </w:r>
       <w:r>
         <w:rPr>
@@ -6048,7 +6048,7 @@
           <w:color w:val="9C2A1E"/>
           <w:sz w:val="20"/>
         </w:rPr>
-        <w:t>{{ año }}</w:t>
+        <w:t>{{ año_ultimo_periodo_final }}</w:t>
       </w:r>
       <w:r>
         <w:rPr>
@@ -9795,7 +9795,7 @@
         <w:rPr>
           <w:rFonts w:ascii="Archivo Light" w:hAnsi="Archivo Light" w:cs="Archivo Light"/>
         </w:rPr>
-        <w:t>{{ insertar_analisis_e_intercalar_graficas_y_o_tablas }}</w:t>
+        <w:t>{{ analisis_indicador_01 }}</w:t>
       </w:r>
     </w:p>
     <w:p>
@@ -9987,7 +9987,7 @@
         <w:rPr>
           <w:rFonts w:ascii="Archivo Light" w:hAnsi="Archivo Light" w:cs="Archivo Light"/>
         </w:rPr>
-        <w:t>{{ insertar_analisis_e_intercalar_graficas_y_o_tablas }}</w:t>
+        <w:t>{{ analisis_indicador_02 }}</w:t>
       </w:r>
     </w:p>
     <w:p>
@@ -10143,7 +10143,7 @@
         <w:rPr>
           <w:rFonts w:ascii="Archivo Light" w:hAnsi="Archivo Light" w:cs="Archivo Light"/>
         </w:rPr>
-        <w:t>{{ insertar_analisis_e_intercalar_graficas_y_o_tablas }}</w:t>
+        <w:t>{{ analisis_indicador_03 }}</w:t>
       </w:r>
     </w:p>
     <w:p>
@@ -11761,7 +11761,7 @@
         <w:rPr>
           <w:rFonts w:ascii="Archivo Light" w:hAnsi="Archivo Light" w:cs="Archivo Light"/>
         </w:rPr>
-        <w:t>{{ insertar_analisis_e_intercalar_graficas_y_o_tablas }}</w:t>
+        <w:t>{{ analisis_indicador_04 }}</w:t>
       </w:r>
     </w:p>
     <w:p>
@@ -11902,7 +11902,7 @@
         <w:rPr>
           <w:rFonts w:ascii="Archivo Light" w:hAnsi="Archivo Light" w:cs="Archivo Light"/>
         </w:rPr>
-        <w:t>{{ insertar_analisis_e_intercalar_graficas_y_o_tablas }}</w:t>
+        <w:t>{{ analisis_indicador_05 }}</w:t>
       </w:r>
     </w:p>
     <w:p>
@@ -12050,7 +12050,7 @@
         <w:rPr>
           <w:rFonts w:ascii="Archivo Light" w:hAnsi="Archivo Light" w:cs="Archivo Light"/>
         </w:rPr>
-        <w:t>{{ insertar_analisis_e_intercalar_graficas_y_o_tablas }}</w:t>
+        <w:t>{{ analisis_indicador_06 }}</w:t>
       </w:r>
     </w:p>
     <w:p>
@@ -12185,7 +12185,7 @@
         <w:rPr>
           <w:rFonts w:ascii="Archivo Light" w:hAnsi="Archivo Light" w:cs="Archivo Light"/>
         </w:rPr>
-        <w:t>{{ insertar_analisis_e_intercalar_graficas_y_o_tablas }}</w:t>
+        <w:t>{{ analisis_indicador_07 }}</w:t>
       </w:r>
     </w:p>
     <w:p>
@@ -12322,7 +12322,7 @@
         <w:rPr>
           <w:rFonts w:ascii="Archivo Light" w:hAnsi="Archivo Light" w:cs="Archivo Light"/>
         </w:rPr>
-        <w:t>{{ insertar_analisis_e_intercalar_graficas_y_o_tablas }}</w:t>
+        <w:t>{{ analisis_indicador_08 }}</w:t>
       </w:r>
     </w:p>
     <w:p>
@@ -12460,7 +12460,7 @@
         <w:rPr>
           <w:rFonts w:ascii="Archivo Light" w:hAnsi="Archivo Light" w:cs="Archivo Light"/>
         </w:rPr>
-        <w:t>{{ insertar_analisis_e_intercalar_graficas_y_o_tablas }}</w:t>
+        <w:t>{{ analisis_indicador_09 }}</w:t>
       </w:r>
     </w:p>
     <w:p>
@@ -12587,7 +12587,7 @@
         <w:rPr>
           <w:rFonts w:ascii="Archivo Light" w:hAnsi="Archivo Light" w:cs="Archivo Light"/>
         </w:rPr>
-        <w:t>{{ insertar_analisis_e_intercalar_graficas_y_o_tablas }}</w:t>
+        <w:t>{{ analisis_indicador_10 }}</w:t>
       </w:r>
     </w:p>
     <w:p>
@@ -14190,7 +14190,7 @@
         <w:rPr>
           <w:rFonts w:ascii="Archivo Light" w:hAnsi="Archivo Light" w:cs="Archivo Light"/>
         </w:rPr>
-        <w:t>{{ insertar_analisis_e_intercalar_graficas_y_o_tablas }}</w:t>
+        <w:t>{{ analisis_indicador_11 }}</w:t>
       </w:r>
     </w:p>
     <w:p>
@@ -14328,7 +14328,7 @@
         <w:rPr>
           <w:rFonts w:ascii="Archivo Light" w:hAnsi="Archivo Light" w:cs="Archivo Light"/>
         </w:rPr>
-        <w:t>{{ insertar_analisis_e_intercalar_graficas_y_o_tablas }}</w:t>
+        <w:t>{{ analisis_indicador_12 }}</w:t>
       </w:r>
     </w:p>
     <w:p>
@@ -14467,7 +14467,7 @@
           <w:rFonts w:ascii="Archivo Light" w:hAnsi="Archivo Light" w:cs="Archivo Light"/>
         </w:rPr>
         <w:lastRenderedPageBreak/>
-        <w:t>{{ insertar_analisis_e_intercalar_graficas_y_o_tablas }}</w:t>
+        <w:t>{{ analisis_indicador_13 }}</w:t>
       </w:r>
     </w:p>
     <w:p>
@@ -14594,7 +14594,7 @@
         <w:rPr>
           <w:rFonts w:ascii="Archivo Light" w:hAnsi="Archivo Light" w:cs="Archivo Light"/>
         </w:rPr>
-        <w:t>{{ insertar_analisis_e_intercalar_graficas_y_o_tablas }}</w:t>
+        <w:t>{{ analisis_indicador_14 }}</w:t>
       </w:r>
     </w:p>
     <w:p>
@@ -14732,7 +14732,7 @@
         <w:rPr>
           <w:rFonts w:ascii="Archivo Light" w:hAnsi="Archivo Light" w:cs="Archivo Light"/>
         </w:rPr>
-        <w:t>{{ insertar_analisis_e_intercalar_graficas_y_o_tablas }}</w:t>
+        <w:t>{{ analisis_indicador_15 }}</w:t>
       </w:r>
     </w:p>
     <w:p>
@@ -14859,7 +14859,7 @@
         <w:rPr>
           <w:rFonts w:ascii="Archivo Light" w:hAnsi="Archivo Light" w:cs="Archivo Light"/>
         </w:rPr>
-        <w:t>{{ insertar_analisis_e_intercalar_graficas_y_o_tablas }}</w:t>
+        <w:t>{{ analisis_indicador_16 }}</w:t>
       </w:r>
     </w:p>
     <w:p>
@@ -15454,7 +15454,7 @@
         <w:rPr>
           <w:rFonts w:ascii="Archivo Light" w:hAnsi="Archivo Light" w:cs="Archivo Light"/>
         </w:rPr>
-        <w:t>{{ insertar_analisis_e_intercalar_graficas_y_o_tablas }}</w:t>
+        <w:t>{{ analisis_indicador_17 }}</w:t>
       </w:r>
     </w:p>
     <w:p>
@@ -15591,7 +15591,7 @@
         <w:rPr>
           <w:rFonts w:ascii="Archivo Light" w:hAnsi="Archivo Light" w:cs="Archivo Light"/>
         </w:rPr>
-        <w:t>{{ insertar_analisis_e_intercalar_graficas_y_o_tablas }}</w:t>
+        <w:t>{{ analisis_indicador_18 }}</w:t>
       </w:r>
     </w:p>
     <w:p>

</xml_diff>

<commit_message>
Integra metodología de seguridad 2.3
</commit_message>
<xml_diff>
--- a/templates/Machote_seguridad_general_con_calificacion.docx
+++ b/templates/Machote_seguridad_general_con_calificacion.docx
@@ -21250,6 +21250,469 @@
         <w:t>– Autores de la revisión 'Strategies for disaster risk reduction education' (2018) y vigencia de la norma NIJ 0101.07.</w:t>
       </w:r>
     </w:p>
+    <w:sdt>
+      <w:sdtPr>
+        <w:tag w:val="integracion_metodologica_2_3"/>
+      </w:sdtPr>
+      <w:sdtContent>
+        <w:p>
+          <w:pPr>
+            <w:keepNext/>
+            <w:spacing w:before="0" w:after="0" w:line="280" w:lineRule="atLeast"/>
+            <w:ind w:left="0" w:right="0" w:firstLine="0"/>
+            <w:jc w:val="left"/>
+          </w:pPr>
+          <w:r>
+            <w:rPr>
+              <w:rFonts w:ascii="Archivo Light" w:hAnsi="Archivo Light" w:eastAsia="Archivo Light" w:cs="Archivo Light"/>
+              <w:sz w:val="48"/>
+              <w:szCs w:val="48"/>
+            </w:rPr>
+            <w:t>Anexo 3. Integración metodológica 2.3</w:t>
+          </w:r>
+        </w:p>
+        <w:p>
+          <w:pPr>
+            <w:spacing w:before="0" w:after="0" w:line="320" w:lineRule="exact"/>
+            <w:ind w:left="0" w:right="0" w:firstLine="0"/>
+            <w:jc w:val="both"/>
+          </w:pPr>
+          <w:r>
+            <w:rPr>
+              <w:rFonts w:ascii="Archivo Light" w:hAnsi="Archivo Light" w:eastAsia="Archivo Light" w:cs="Archivo Light"/>
+              <w:sz w:val="24"/>
+              <w:szCs w:val="24"/>
+            </w:rPr>
+            <w:t>Este anexo prevalece sobre los criterios históricos incompatibles del cuerpo anterior. Conserva 18 indicadores y escala de 1 a 5. Las nuevas convenciones son decisiones de integración del equipo, no estándares externos verificados. Es material interno; no se entrega con el estudio municipal.</w:t>
+          </w:r>
+        </w:p>
+        <w:p>
+          <w:pPr>
+            <w:keepNext/>
+            <w:spacing w:before="0" w:after="0" w:line="280" w:lineRule="atLeast"/>
+            <w:ind w:left="0" w:right="0" w:firstLine="0"/>
+            <w:jc w:val="left"/>
+          </w:pPr>
+          <w:r>
+            <w:rPr>
+              <w:rFonts w:ascii="Archivo Light" w:hAnsi="Archivo Light" w:eastAsia="Archivo Light" w:cs="Archivo Light"/>
+              <w:sz w:val="48"/>
+              <w:szCs w:val="48"/>
+            </w:rPr>
+            <w:t>Ponderación y cobertura</w:t>
+          </w:r>
+        </w:p>
+        <w:p>
+          <w:pPr>
+            <w:spacing w:before="0" w:after="0" w:line="320" w:lineRule="exact"/>
+            <w:ind w:left="0" w:right="0" w:firstLine="0"/>
+            <w:jc w:val="both"/>
+          </w:pPr>
+          <w:r>
+            <w:rPr>
+              <w:rFonts w:ascii="Archivo Light" w:hAnsi="Archivo Light" w:eastAsia="Archivo Light" w:cs="Archivo Light"/>
+              <w:sz w:val="24"/>
+              <w:szCs w:val="24"/>
+            </w:rPr>
+            <w:t>Protección civil: 25%; condiciones del personal: 35%; inteligencia y eficiencia policial: 40%. Dentro de cada dimensión, los indicadores 2, 4, 5, 10, 11, 12, 13 y 14 pesan 2; los restantes pesan 1. Sólo entran al promedio puntajes observados y acreditados.</w:t>
+          </w:r>
+        </w:p>
+        <w:p>
+          <w:pPr>
+            <w:spacing w:before="0" w:after="0" w:line="320" w:lineRule="exact"/>
+            <w:ind w:left="0" w:right="0" w:firstLine="0"/>
+            <w:jc w:val="both"/>
+          </w:pPr>
+          <w:r>
+            <w:rPr>
+              <w:rFonts w:ascii="Archivo Light" w:hAnsi="Archivo Light" w:eastAsia="Archivo Light" w:cs="Archivo Light"/>
+              <w:sz w:val="24"/>
+              <w:szCs w:val="24"/>
+            </w:rPr>
+            <w:t>Cobertura mínima: 2 de 3, 5 de 7 y 6 de 8 indicadores por dimensión, además de seis de los ocho prioritarios. El modo completo requiere los dieciocho. Con pendientes, el máximo es MUY BIEN. Un universo no aplicable requiere una metodología específica y bloquea la calificación conjunta; no equivale a incumplimiento.</w:t>
+          </w:r>
+        </w:p>
+        <w:p>
+          <w:pPr>
+            <w:spacing w:before="0" w:after="0" w:line="320" w:lineRule="exact"/>
+            <w:ind w:left="0" w:right="0" w:firstLine="0"/>
+            <w:jc w:val="both"/>
+          </w:pPr>
+          <w:r>
+            <w:rPr>
+              <w:rFonts w:ascii="Archivo Light" w:hAnsi="Archivo Light" w:eastAsia="Archivo Light" w:cs="Archivo Light"/>
+              <w:sz w:val="24"/>
+              <w:szCs w:val="24"/>
+            </w:rPr>
+            <w:t>Candado 7: Se pretende asignar EXCELENTE. Los ocho indicadores prioritarios tienen puntaje igual o mayor que 4.</w:t>
+          </w:r>
+        </w:p>
+        <w:p>
+          <w:pPr>
+            <w:spacing w:before="0" w:after="0" w:line="320" w:lineRule="exact"/>
+            <w:ind w:left="0" w:right="0" w:firstLine="0"/>
+            <w:jc w:val="both"/>
+          </w:pPr>
+          <w:r>
+            <w:rPr>
+              <w:rFonts w:ascii="Archivo Light" w:hAnsi="Archivo Light" w:eastAsia="Archivo Light" w:cs="Archivo Light"/>
+              <w:sz w:val="24"/>
+              <w:szCs w:val="24"/>
+            </w:rPr>
+            <w:t>Candado 8: Se pretende asignar MUY BIEN. Promedio ponderado de los prioritarios igual o mayor que 3.00. Ningún prioritario con puntaje 1.</w:t>
+          </w:r>
+        </w:p>
+        <w:p>
+          <w:pPr>
+            <w:spacing w:before="0" w:after="0" w:line="320" w:lineRule="exact"/>
+            <w:ind w:left="0" w:right="0" w:firstLine="0"/>
+            <w:jc w:val="both"/>
+          </w:pPr>
+          <w:r>
+            <w:rPr>
+              <w:rFonts w:ascii="Archivo Light" w:hAnsi="Archivo Light" w:eastAsia="Archivo Light" w:cs="Archivo Light"/>
+              <w:sz w:val="24"/>
+              <w:szCs w:val="24"/>
+            </w:rPr>
+            <w:t>Candado 9: Cuatro o más prioritarios con puntaje 1 por falta de respuesta acreditada. La calificación no puede superar MAL.</w:t>
+          </w:r>
+        </w:p>
+        <w:p>
+          <w:pPr>
+            <w:keepNext/>
+            <w:spacing w:before="0" w:after="0" w:line="280" w:lineRule="atLeast"/>
+            <w:ind w:left="0" w:right="0" w:firstLine="0"/>
+            <w:jc w:val="left"/>
+          </w:pPr>
+          <w:r>
+            <w:rPr>
+              <w:rFonts w:ascii="Archivo Light" w:hAnsi="Archivo Light" w:eastAsia="Archivo Light" w:cs="Archivo Light"/>
+              <w:sz w:val="48"/>
+              <w:szCs w:val="48"/>
+            </w:rPr>
+            <w:t>Definición de la evidencia</w:t>
+          </w:r>
+        </w:p>
+        <w:p>
+          <w:pPr>
+            <w:spacing w:before="0" w:after="0" w:line="320" w:lineRule="exact"/>
+            <w:ind w:left="0" w:right="0" w:firstLine="0"/>
+            <w:jc w:val="both"/>
+          </w:pPr>
+          <w:r>
+            <w:rPr>
+              <w:rFonts w:ascii="Archivo Light" w:hAnsi="Archivo Light" w:eastAsia="Archivo Light" w:cs="Archivo Light"/>
+              <w:sz w:val="24"/>
+              <w:szCs w:val="24"/>
+            </w:rPr>
+            <w:t>Cada confirmación requiere fuente conservada con huella, año, localizador y revisión. Los manuales censales describen variables, pero no acreditan por sí solos qué variable se copió al paquete municipal. No se asigna 1 por una celda vacía. Los candados de falta de respuesta requieren acreditar esa causa.</w:t>
+          </w:r>
+        </w:p>
+        <w:p>
+          <w:pPr>
+            <w:spacing w:before="0" w:after="0" w:line="320" w:lineRule="exact"/>
+            <w:ind w:left="0" w:right="0" w:firstLine="0"/>
+            <w:jc w:val="both"/>
+          </w:pPr>
+          <w:r>
+            <w:rPr>
+              <w:rFonts w:ascii="Archivo Light" w:hAnsi="Archivo Light" w:eastAsia="Archivo Light" w:cs="Archivo Light"/>
+              <w:sz w:val="24"/>
+              <w:szCs w:val="24"/>
+            </w:rPr>
+            <w:t>Personal: utilizar corporaciones policiales, sin administrativos, en las tasas; el denominador es población documentada por año. Una plantilla menor de 15 limita la ficha 4 a 4. Control de confianza: aprobatorias vigentes; CUP: vigente. Capacitación: no confundir con profesionalización ni sumar participantes duplicados. La capacitación de protección civil distingue personal de la unidad de cursos a la población.</w:t>
+          </w:r>
+        </w:p>
+        <w:p>
+          <w:pPr>
+            <w:spacing w:before="0" w:after="0" w:line="320" w:lineRule="exact"/>
+            <w:ind w:left="0" w:right="0" w:firstLine="0"/>
+            <w:jc w:val="both"/>
+          </w:pPr>
+          <w:r>
+            <w:rPr>
+              <w:rFonts w:ascii="Archivo Light" w:hAnsi="Archivo Light" w:eastAsia="Archivo Light" w:cs="Archivo Light"/>
+              <w:sz w:val="24"/>
+              <w:szCs w:val="24"/>
+            </w:rPr>
+            <w:t>Equipo: cantidades asignadas al cierre, no compras anuales; cámaras: en servicio. Población municipal y estatal de la misma serie, fecha y método para comparaciones. Puestas a disposición: separar MP de justicia cívica y dividir entre incidencia comparable, no población. El máximo requiere revisión documentada de derechos humanos y uso de la fuerza; una razón superior al doble estatal no obtiene 5.</w:t>
+          </w:r>
+        </w:p>
+        <w:p>
+          <w:pPr>
+            <w:keepNext/>
+            <w:spacing w:before="0" w:after="0" w:line="280" w:lineRule="atLeast"/>
+            <w:ind w:left="0" w:right="0" w:firstLine="0"/>
+            <w:jc w:val="left"/>
+          </w:pPr>
+          <w:r>
+            <w:rPr>
+              <w:rFonts w:ascii="Archivo Light" w:hAnsi="Archivo Light" w:eastAsia="Archivo Light" w:cs="Archivo Light"/>
+              <w:sz w:val="48"/>
+              <w:szCs w:val="48"/>
+            </w:rPr>
+            <w:t>Ficha 3. Cobertura temática</w:t>
+          </w:r>
+        </w:p>
+        <w:p>
+          <w:pPr>
+            <w:spacing w:before="0" w:after="0" w:line="320" w:lineRule="exact"/>
+            <w:ind w:left="0" w:right="0" w:firstLine="0"/>
+            <w:jc w:val="both"/>
+          </w:pPr>
+          <w:r>
+            <w:rPr>
+              <w:rFonts w:ascii="Archivo Light" w:hAnsi="Archivo Light" w:eastAsia="Archivo Light" w:cs="Archivo Light"/>
+              <w:sz w:val="24"/>
+              <w:szCs w:val="24"/>
+            </w:rPr>
+            <w:t>Cobertura anual sobre grupos captados acreditados por edición; general usa la media de coberturas. Sin catálogo no puntúa.</w:t>
+          </w:r>
+        </w:p>
+        <w:p>
+          <w:pPr>
+            <w:spacing w:before="0" w:after="0" w:line="320" w:lineRule="exact"/>
+            <w:ind w:left="0" w:right="0" w:firstLine="0"/>
+            <w:jc w:val="both"/>
+          </w:pPr>
+          <w:r>
+            <w:rPr>
+              <w:rFonts w:ascii="Archivo Light" w:hAnsi="Archivo Light" w:eastAsia="Archivo Light" w:cs="Archivo Light"/>
+              <w:sz w:val="24"/>
+              <w:szCs w:val="24"/>
+            </w:rPr>
+            <w:t>Nivel 5: &gt;=80% y análisis de riesgos en cada observación evaluada.</w:t>
+          </w:r>
+        </w:p>
+        <w:p>
+          <w:pPr>
+            <w:spacing w:before="0" w:after="0" w:line="320" w:lineRule="exact"/>
+            <w:ind w:left="0" w:right="0" w:firstLine="0"/>
+            <w:jc w:val="both"/>
+          </w:pPr>
+          <w:r>
+            <w:rPr>
+              <w:rFonts w:ascii="Archivo Light" w:hAnsi="Archivo Light" w:eastAsia="Archivo Light" w:cs="Archivo Light"/>
+              <w:sz w:val="24"/>
+              <w:szCs w:val="24"/>
+            </w:rPr>
+            <w:t>Nivel 4: &gt;=2/3; máximo si falta análisis de riesgos.</w:t>
+          </w:r>
+        </w:p>
+        <w:p>
+          <w:pPr>
+            <w:spacing w:before="0" w:after="0" w:line="320" w:lineRule="exact"/>
+            <w:ind w:left="0" w:right="0" w:firstLine="0"/>
+            <w:jc w:val="both"/>
+          </w:pPr>
+          <w:r>
+            <w:rPr>
+              <w:rFonts w:ascii="Archivo Light" w:hAnsi="Archivo Light" w:eastAsia="Archivo Light" w:cs="Archivo Light"/>
+              <w:sz w:val="24"/>
+              <w:szCs w:val="24"/>
+            </w:rPr>
+            <w:t>Nivel 3: &gt;=1/3.</w:t>
+          </w:r>
+        </w:p>
+        <w:p>
+          <w:pPr>
+            <w:spacing w:before="0" w:after="0" w:line="320" w:lineRule="exact"/>
+            <w:ind w:left="0" w:right="0" w:firstLine="0"/>
+            <w:jc w:val="both"/>
+          </w:pPr>
+          <w:r>
+            <w:rPr>
+              <w:rFonts w:ascii="Archivo Light" w:hAnsi="Archivo Light" w:eastAsia="Archivo Light" w:cs="Archivo Light"/>
+              <w:sz w:val="24"/>
+              <w:szCs w:val="24"/>
+            </w:rPr>
+            <w:t>Nivel 2: &gt;0.</w:t>
+          </w:r>
+        </w:p>
+        <w:p>
+          <w:pPr>
+            <w:spacing w:before="0" w:after="0" w:line="320" w:lineRule="exact"/>
+            <w:ind w:left="0" w:right="0" w:firstLine="0"/>
+            <w:jc w:val="both"/>
+          </w:pPr>
+          <w:r>
+            <w:rPr>
+              <w:rFonts w:ascii="Archivo Light" w:hAnsi="Archivo Light" w:eastAsia="Archivo Light" w:cs="Archivo Light"/>
+              <w:sz w:val="24"/>
+              <w:szCs w:val="24"/>
+            </w:rPr>
+            <w:t>Nivel 1: 0 con ausencia explícita y catálogo completo.</w:t>
+          </w:r>
+        </w:p>
+        <w:p>
+          <w:pPr>
+            <w:spacing w:before="0" w:after="0" w:line="320" w:lineRule="exact"/>
+            <w:ind w:left="0" w:right="0" w:firstLine="0"/>
+            <w:jc w:val="both"/>
+          </w:pPr>
+          <w:r>
+            <w:rPr>
+              <w:rFonts w:ascii="Archivo Light" w:hAnsi="Archivo Light" w:eastAsia="Archivo Light" w:cs="Archivo Light"/>
+              <w:sz w:val="24"/>
+              <w:szCs w:val="24"/>
+            </w:rPr>
+            <w:t>Convención de integración: completa escalones que la propuesta dejó sin definir.</w:t>
+          </w:r>
+        </w:p>
+        <w:p>
+          <w:pPr>
+            <w:keepNext/>
+            <w:spacing w:before="0" w:after="0" w:line="280" w:lineRule="atLeast"/>
+            <w:ind w:left="0" w:right="0" w:firstLine="0"/>
+            <w:jc w:val="left"/>
+          </w:pPr>
+          <w:r>
+            <w:rPr>
+              <w:rFonts w:ascii="Archivo Light" w:hAnsi="Archivo Light" w:eastAsia="Archivo Light" w:cs="Archivo Light"/>
+              <w:sz w:val="48"/>
+              <w:szCs w:val="48"/>
+            </w:rPr>
+            <w:t>Ficha 15. Registro y respuesta</w:t>
+          </w:r>
+        </w:p>
+        <w:p>
+          <w:pPr>
+            <w:spacing w:before="0" w:after="0" w:line="320" w:lineRule="exact"/>
+            <w:ind w:left="0" w:right="0" w:firstLine="0"/>
+            <w:jc w:val="both"/>
+          </w:pPr>
+          <w:r>
+            <w:rPr>
+              <w:rFonts w:ascii="Archivo Light" w:hAnsi="Archivo Light" w:eastAsia="Archivo Light" w:cs="Archivo Light"/>
+              <w:sz w:val="24"/>
+              <w:szCs w:val="24"/>
+            </w:rPr>
+            <w:t>Registro de competencia municipal y población documentados. No se interpreta volumen como eficacia.</w:t>
+          </w:r>
+        </w:p>
+        <w:p>
+          <w:pPr>
+            <w:spacing w:before="0" w:after="0" w:line="320" w:lineRule="exact"/>
+            <w:ind w:left="0" w:right="0" w:firstLine="0"/>
+            <w:jc w:val="both"/>
+          </w:pPr>
+          <w:r>
+            <w:rPr>
+              <w:rFonts w:ascii="Archivo Light" w:hAnsi="Archivo Light" w:eastAsia="Archivo Light" w:cs="Archivo Light"/>
+              <w:sz w:val="24"/>
+              <w:szCs w:val="24"/>
+            </w:rPr>
+            <w:t>Nivel 5: Registro completo, tasas calculables y cumplimiento documentado de meta de respuesta/despacho en todo el periodo.</w:t>
+          </w:r>
+        </w:p>
+        <w:p>
+          <w:pPr>
+            <w:spacing w:before="0" w:after="0" w:line="320" w:lineRule="exact"/>
+            <w:ind w:left="0" w:right="0" w:firstLine="0"/>
+            <w:jc w:val="both"/>
+          </w:pPr>
+          <w:r>
+            <w:rPr>
+              <w:rFonts w:ascii="Archivo Light" w:hAnsi="Archivo Light" w:eastAsia="Archivo Light" w:cs="Archivo Light"/>
+              <w:sz w:val="24"/>
+              <w:szCs w:val="24"/>
+            </w:rPr>
+            <w:t>Nivel 4: Registro completo y tasas calculables, sin meta de respuesta acreditada.</w:t>
+          </w:r>
+        </w:p>
+        <w:p>
+          <w:pPr>
+            <w:spacing w:before="0" w:after="0" w:line="320" w:lineRule="exact"/>
+            <w:ind w:left="0" w:right="0" w:firstLine="0"/>
+            <w:jc w:val="both"/>
+          </w:pPr>
+          <w:r>
+            <w:rPr>
+              <w:rFonts w:ascii="Archivo Light" w:hAnsi="Archivo Light" w:eastAsia="Archivo Light" w:cs="Archivo Light"/>
+              <w:sz w:val="24"/>
+              <w:szCs w:val="24"/>
+            </w:rPr>
+            <w:t>Nivel 3: Registro parcial con ambos cortes recientes; o inconsistencia pendiente (incluye 100%).</w:t>
+          </w:r>
+        </w:p>
+        <w:p>
+          <w:pPr>
+            <w:spacing w:before="0" w:after="0" w:line="320" w:lineRule="exact"/>
+            <w:ind w:left="0" w:right="0" w:firstLine="0"/>
+            <w:jc w:val="both"/>
+          </w:pPr>
+          <w:r>
+            <w:rPr>
+              <w:rFonts w:ascii="Archivo Light" w:hAnsi="Archivo Light" w:eastAsia="Archivo Light" w:cs="Archivo Light"/>
+              <w:sz w:val="24"/>
+              <w:szCs w:val="24"/>
+            </w:rPr>
+            <w:t>Nivel 2: Registro previo que falta en ambos cortes recientes por ausencia acreditada.</w:t>
+          </w:r>
+        </w:p>
+        <w:p>
+          <w:pPr>
+            <w:spacing w:before="0" w:after="0" w:line="320" w:lineRule="exact"/>
+            <w:ind w:left="0" w:right="0" w:firstLine="0"/>
+            <w:jc w:val="both"/>
+          </w:pPr>
+          <w:r>
+            <w:rPr>
+              <w:rFonts w:ascii="Archivo Light" w:hAnsi="Archivo Light" w:eastAsia="Archivo Light" w:cs="Archivo Light"/>
+              <w:sz w:val="24"/>
+              <w:szCs w:val="24"/>
+            </w:rPr>
+            <w:t>Nivel 1: Ausencia de registro acreditada en todos los cortes aplicables.</w:t>
+          </w:r>
+        </w:p>
+        <w:p>
+          <w:pPr>
+            <w:spacing w:before="0" w:after="0" w:line="320" w:lineRule="exact"/>
+            <w:ind w:left="0" w:right="0" w:firstLine="0"/>
+            <w:jc w:val="both"/>
+          </w:pPr>
+          <w:r>
+            <w:rPr>
+              <w:rFonts w:ascii="Archivo Light" w:hAnsi="Archivo Light" w:eastAsia="Archivo Light" w:cs="Archivo Light"/>
+              <w:sz w:val="24"/>
+              <w:szCs w:val="24"/>
+            </w:rPr>
+            <w:t>Convención de integración documentada; sustituye comparación del porcentaje como desempeño.</w:t>
+          </w:r>
+        </w:p>
+        <w:p>
+          <w:pPr>
+            <w:keepNext/>
+            <w:spacing w:before="0" w:after="0" w:line="280" w:lineRule="atLeast"/>
+            <w:ind w:left="0" w:right="0" w:firstLine="0"/>
+            <w:jc w:val="left"/>
+          </w:pPr>
+          <w:r>
+            <w:rPr>
+              <w:rFonts w:ascii="Archivo Light" w:hAnsi="Archivo Light" w:eastAsia="Archivo Light" w:cs="Archivo Light"/>
+              <w:sz w:val="48"/>
+              <w:szCs w:val="48"/>
+            </w:rPr>
+            <w:t>Valoración provisional y revisión editorial</w:t>
+          </w:r>
+        </w:p>
+        <w:p>
+          <w:pPr>
+            <w:spacing w:before="0" w:after="0" w:line="320" w:lineRule="exact"/>
+            <w:ind w:left="0" w:right="0" w:firstLine="0"/>
+            <w:jc w:val="both"/>
+          </w:pPr>
+          <w:r>
+            <w:rPr>
+              <w:rFonts w:ascii="Archivo Light" w:hAnsi="Archivo Light" w:eastAsia="Archivo Light" w:cs="Archivo Light"/>
+              <w:sz w:val="24"/>
+              <w:szCs w:val="24"/>
+            </w:rPr>
+            <w:t>Una apreciación provisional se conserva separada del puntaje, con base y confianza. No aumenta cobertura ni estrecha el intervalo extremo de 1 a 5; el escenario intermedio, cuando puede calcularse, no es un resultado observado. El texto exige lectura de los datos y revisión semántica; no se asignan párrafos automáticamente según el color. Los 144 cierres anunciados no se recibieron y no forman parte del catálogo disponible.</w:t>
+          </w:r>
+        </w:p>
+      </w:sdtContent>
+    </w:sdt>
     <w:sectPr>
       <w:pgSz w:w="15840" w:h="12240" w:orient="landscape" w:code="1"/>
       <w:pgMar w:top="1008" w:right="1008" w:bottom="1008" w:left="1008" w:header="709" w:footer="709" w:gutter="0"/>

</xml_diff>

<commit_message>
Incorpora lectura de gráficas y evidencia INEGI con base censal 2020
</commit_message>
<xml_diff>
--- a/templates/Machote_seguridad_general_con_calificacion.docx
+++ b/templates/Machote_seguridad_general_con_calificacion.docx
@@ -21421,6 +21421,21 @@
               <w:szCs w:val="24"/>
             </w:rPr>
             <w:t>Las correspondencias explícitas se resuelven automáticamente desde las entradas, conservando regla y coordenadas. El título Certificado Único Policial vigente y su porcentaje publicado permiten homologar la ficha 7 con la definición general, sin reconstruir denominadores ni declarar una verificación externa. No se exige un complemento para repetir lo ya identificado; las ambigüedades y contradicciones se conservan para revisión.</w:t>
+          </w:r>
+        </w:p>
+        <w:p>
+          <w:pPr>
+            <w:spacing w:before="0" w:after="0" w:line="320" w:lineRule="exact"/>
+            <w:ind w:left="0" w:right="0" w:firstLine="0"/>
+            <w:jc w:val="both"/>
+          </w:pPr>
+          <w:r>
+            <w:rPr>
+              <w:rFonts w:ascii="Archivo Light" w:hAnsi="Archivo Light" w:eastAsia="Archivo Light" w:cs="Archivo Light"/>
+              <w:sz w:val="24"/>
+              <w:szCs w:val="24"/>
+            </w:rPr>
+            <w:t>También se leen los títulos incrustados en las gráficas mediante OCR local. Cada lectura conserva la imagen y sus huellas. Una gráfica que dice evaluaciones aprobadas resuelve ese estatus, aunque la vigencia siga pendiente. Las cámaras se reconocen en servicio cuando los títulos municipal y estatal indican funcionamiento. Las cifras proceden de las tablas; los años no se extienden más allá del intervalo explícito del título.</w:t>
           </w:r>
         </w:p>
         <w:p>

</xml_diff>

<commit_message>
Reorganiza proyecto y ajusta metodología de evaluación
</commit_message>
<xml_diff>
--- a/templates/Machote_seguridad_general_con_calificacion.docx
+++ b/templates/Machote_seguridad_general_con_calificacion.docx
@@ -21315,6 +21315,21 @@
               <w:szCs w:val="24"/>
             </w:rPr>
             <w:t>Protección civil: 25%; condiciones del personal: 35%; inteligencia y eficiencia policial: 40%. Dentro de cada dimensión, los indicadores 2, 4, 5, 10, 11, 12, 13 y 14 pesan 2; los restantes pesan 1. Sólo entran al promedio puntajes observados y acreditados.</w:t>
+          </w:r>
+        </w:p>
+        <w:p>
+          <w:pPr>
+            <w:spacing w:before="0" w:after="0" w:line="320" w:lineRule="exact"/>
+            <w:ind w:left="0" w:right="0" w:firstLine="0"/>
+            <w:jc w:val="both"/>
+          </w:pPr>
+          <w:r>
+            <w:rPr>
+              <w:rFonts w:ascii="Archivo Light" w:hAnsi="Archivo Light" w:eastAsia="Archivo Light" w:cs="Archivo Light"/>
+              <w:sz w:val="24"/>
+              <w:szCs w:val="24"/>
+            </w:rPr>
+            <w:t>Prioridad del cierre: en las fichas 5 y 7, cuando los porcentajes comparables de las dos ediciones recientes muestran una mejora en la última, el promedio para calificar el periodo reciente es (primero + 2 × último) / 3. Sin mejora se conserva el promedio ordinario. El mínimo anual exigido para el nivel 5 y los candados permanecen. No se equiparan aumentos de conteos con mejor desempeño.</w:t>
           </w:r>
         </w:p>
         <w:p>

</xml_diff>

<commit_message>
Integra referencias verificadas en plataforma electoral de seguridad
</commit_message>
<xml_diff>
--- a/templates/Machote_seguridad_general_con_calificacion.docx
+++ b/templates/Machote_seguridad_general_con_calificacion.docx
@@ -21268,7 +21268,7 @@
               <w:sz w:val="48"/>
               <w:szCs w:val="48"/>
             </w:rPr>
-            <w:t>Anexo 3. Integración metodológica 2.3</w:t>
+            <w:t>Anexo 3. Integración metodológica 2.3 con definiciones verificadas 2.5</w:t>
           </w:r>
         </w:p>
         <w:p>
@@ -21480,7 +21480,22 @@
               <w:sz w:val="24"/>
               <w:szCs w:val="24"/>
             </w:rPr>
-            <w:t>Equipo: cantidades asignadas al cierre, no compras anuales; cámaras: en servicio. Población municipal y estatal de la misma serie, fecha y método para comparaciones. Puestas a disposición: separar MP de justicia cívica y dividir entre incidencia comparable, no población. El máximo requiere revisión documentada de derechos humanos y uso de la fuerza; una razón superior al doble estatal no obtiene 5.</w:t>
+            <w:t>Equipo: cantidades asignadas al cierre, no compras anuales; cámaras: en servicio. Población municipal y estatal de la misma serie, fecha y método para comparaciones. Puestas a disposición: separar Ministerio Público de justicia cívica y comparar tasas por cien mil habitantes del mismo universo y año. La incidencia delictiva sólo aporta contexto, no sirve de denominador. Sin dato estatal homólogo o población comparable, la ficha queda pendiente; nunca se presume nivel 1. El máximo requiere revisión documentada de derechos humanos y uso de la fuerza; una razón superior al doble estatal no obtiene 5.</w:t>
+          </w:r>
+        </w:p>
+        <w:p>
+          <w:pPr>
+            <w:spacing w:before="0" w:after="0" w:line="320" w:lineRule="exact"/>
+            <w:ind w:left="0" w:right="0" w:firstLine="0"/>
+            <w:jc w:val="both"/>
+          </w:pPr>
+          <w:r>
+            <w:rPr>
+              <w:rFonts w:ascii="Archivo Light" w:hAnsi="Archivo Light" w:eastAsia="Archivo Light" w:cs="Archivo Light"/>
+              <w:sz w:val="24"/>
+              <w:szCs w:val="24"/>
+            </w:rPr>
+            <w:t>Control de confianza: el seguimiento estatal del CNCA/SESNSP se utiliza como alerta documental, no como rebaja automática de una corporación municipal. Se debe conciliar edición, corte, universo policial y vigencia antes de decidir. Un agregado estatal no prueba la situación de un municipio.</w:t>
           </w:r>
         </w:p>
         <w:p>

</xml_diff>